<commit_message>
Align capstone report guidance with prior example
Co-authored-by: arena-agent <297053741+arena-agent@users.noreply.github.com>
</commit_message>
<xml_diff>
--- a/毕业设计：会计岗位基础实践任务汇总与校对/四门课程维度_15套漫画视频互动任务三人实施方案_v7.0.docx
+++ b/毕业设计：会计岗位基础实践任务汇总与校对/四门课程维度_15套漫画视频互动任务三人实施方案_v7.0.docx
@@ -1,6 +1,6 @@
 
 <file path=word/document.xml><?xml version="1.0" encoding="utf-8"?>
-<w:document xmlns:w="http://schemas.openxmlformats.org/wordprocessingml/2006/main" xmlns:r="http://schemas.openxmlformats.org/officeDocument/2006/relationships">
+<w:document xmlns:r="http://schemas.openxmlformats.org/officeDocument/2006/relationships" xmlns:w="http://schemas.openxmlformats.org/wordprocessingml/2006/main">
   <w:body>
     <w:p>
       <w:pPr>
@@ -109,7 +109,7 @@
           <w:szCs w:val="19"/>
           <w:lang w:val="zh-CN" w:eastAsia="zh-CN"/>
         </w:rPr>
-        <w:t xml:space="preserve">关于往届范例：</w:t>
+        <w:t xml:space="preserve">往届范例结构参考：</w:t>
       </w:r>
       <w:r>
         <w:rPr>
@@ -118,45 +118,7 @@
           <w:szCs w:val="19"/>
           <w:lang w:val="zh-CN" w:eastAsia="zh-CN"/>
         </w:rPr>
-        <w:t xml:space="preserve">我在当前工作副本、已取回的 </w:t>
-      </w:r>
-      <w:r>
-        <w:rPr>
-          <w:rFonts w:ascii="Consolas" w:hAnsi="Consolas" w:eastAsia="等线"/>
-          <w:color w:val="3D5A73"/>
-          <w:sz w:val="19"/>
-          <w:szCs w:val="19"/>
-          <w:lang w:val="zh-CN" w:eastAsia="zh-CN"/>
-        </w:rPr>
-        <w:t xml:space="preserve">origin/main</w:t>
-      </w:r>
-      <w:r>
-        <w:rPr>
-          <w:rFonts w:ascii="宋体" w:hAnsi="宋体" w:eastAsia="宋体"/>
-          <w:sz w:val="19"/>
-          <w:szCs w:val="19"/>
-          <w:lang w:val="zh-CN" w:eastAsia="zh-CN"/>
-        </w:rPr>
-        <w:t xml:space="preserve"> 和工作分支中都没有找到你提到的《财务机器人技能竞赛技能梳理与应用创新毕设报告终稿.doc》。因此本版先把学生要完成的资源、视频、展示和报告内容写清楚；报告封面、章节名称和版式暂按通用毕业设计要求拟定，待该 </w:t>
-      </w:r>
-      <w:r>
-        <w:rPr>
-          <w:rFonts w:ascii="Consolas" w:hAnsi="Consolas" w:eastAsia="等线"/>
-          <w:color w:val="3D5A73"/>
-          <w:sz w:val="19"/>
-          <w:szCs w:val="19"/>
-          <w:lang w:val="zh-CN" w:eastAsia="zh-CN"/>
-        </w:rPr>
-        <w:t xml:space="preserve">.doc</w:t>
-      </w:r>
-      <w:r>
-        <w:rPr>
-          <w:rFonts w:ascii="宋体" w:hAnsi="宋体" w:eastAsia="宋体"/>
-          <w:sz w:val="19"/>
-          <w:szCs w:val="19"/>
-          <w:lang w:val="zh-CN" w:eastAsia="zh-CN"/>
-        </w:rPr>
-        <w:t xml:space="preserve"> 文件实际进入仓库后再逐项对齐，避免假称已参考。</w:t>
+        <w:t xml:space="preserve">本仓库现已纳入《财务机器人技能竞赛技能梳理与应用创新毕设报告终稿 .doc》。本方案借鉴其“封面/评定材料与目录—绪论—按阶段展开的项目主体—实施问题及解决方案—参考文献—成员心得/过程附录”的组织方式；只参考报告结构，不沿用其财务机器人竞赛题库主题、案例或原文。本届报告聚焦 15 套漫画、视频与互动任务，封面、格式及最终章节要求以本届学院模板和指导教师要求为准。</w:t>
       </w:r>
     </w:p>
     <w:p>
@@ -4109,25 +4071,157 @@
           <w:rFonts w:ascii="宋体" w:hAnsi="宋体" w:eastAsia="宋体"/>
           <w:lang w:val="zh-CN" w:eastAsia="zh-CN"/>
         </w:rPr>
-        <w:t xml:space="preserve">八、毕业设计报告要求及范例文件状态</w:t>
-      </w:r>
-    </w:p>
-    <w:p>
-      <w:r>
-        <w:rPr>
-          <w:rFonts w:ascii="宋体" w:hAnsi="宋体" w:eastAsia="宋体"/>
-          <w:lang w:val="zh-CN" w:eastAsia="zh-CN"/>
-        </w:rPr>
-        <w:t xml:space="preserve">报告内容建议包括：项目背景与目标；四门课在项目中的关系；三人分工和 15 个专题来源；连环画脚本/分镜和视频镜头脚本制作；互动任务设计及答案；AI 工具使用与内容校对；试做反馈和修改；成果展示与个人反思；参考资料和附件。</w:t>
-      </w:r>
-    </w:p>
-    <w:p>
-      <w:r>
-        <w:rPr>
-          <w:rFonts w:ascii="宋体" w:hAnsi="宋体" w:eastAsia="宋体"/>
-          <w:lang w:val="zh-CN" w:eastAsia="zh-CN"/>
-        </w:rPr>
-        <w:t xml:space="preserve">你提到的《财务机器人技能竞赛技能梳理与应用创新毕设报告终稿.doc》目前在当前仓库检索不到。请将该范例文件放入工作分支/确认文件路径后，才能对封面、目录、章节结构、格式、引用和附件要求做逐项对照。本方案先给出内容清单，不声称已照该范例排版。</w:t>
+        <w:t xml:space="preserve">八、毕业设计报告要求（参考往届范例结构）</w:t>
+      </w:r>
+    </w:p>
+    <w:p>
+      <w:r>
+        <w:rPr>
+          <w:rFonts w:ascii="宋体" w:hAnsi="宋体" w:eastAsia="宋体"/>
+          <w:lang w:val="zh-CN" w:eastAsia="zh-CN"/>
+        </w:rPr>
+        <w:t xml:space="preserve">往届范例采用封面/评定材料、目录、绪论、按工作阶段展开的项目主体、项目实施问题及解决方案、参考文献和成员心得/过程附录。本方案只借鉴这种组织方式，具体内容聚焦本届 15 套漫画、视频和互动任务；不沿用范例的题库主题、案例、原文或学生信息。</w:t>
+      </w:r>
+    </w:p>
+    <w:p>
+      <w:pPr>
+        <w:pStyle w:val="Heading2"/>
+      </w:pPr>
+      <w:r>
+        <w:rPr>
+          <w:rFonts w:ascii="宋体" w:hAnsi="宋体" w:eastAsia="宋体"/>
+          <w:lang w:val="zh-CN" w:eastAsia="zh-CN"/>
+        </w:rPr>
+        <w:t xml:space="preserve">建议的本项目报告提纲（按本届学院模板调整）</w:t>
+      </w:r>
+    </w:p>
+    <w:p>
+      <w:r>
+        <w:rPr>
+          <w:rFonts w:ascii="宋体" w:hAnsi="宋体" w:eastAsia="宋体"/>
+          <w:lang w:val="zh-CN" w:eastAsia="zh-CN"/>
+        </w:rPr>
+        <w:t xml:space="preserve">前置部分：封面、毕业设计评定/答辩材料、目录等，按本届学校模板填写真实信息。</w:t>
+      </w:r>
+    </w:p>
+    <w:p>
+      <w:pPr>
+        <w:pStyle w:val="Heading2"/>
+      </w:pPr>
+      <w:r>
+        <w:rPr>
+          <w:rFonts w:ascii="宋体" w:hAnsi="宋体" w:eastAsia="宋体"/>
+          <w:lang w:val="zh-CN" w:eastAsia="zh-CN"/>
+        </w:rPr>
+        <w:t xml:space="preserve">1 绪论</w:t>
+      </w:r>
+    </w:p>
+    <w:p>
+      <w:r>
+        <w:rPr>
+          <w:rFonts w:ascii="宋体" w:hAnsi="宋体" w:eastAsia="宋体"/>
+          <w:lang w:val="zh-CN" w:eastAsia="zh-CN"/>
+        </w:rPr>
+        <w:t xml:space="preserve">1.1 项目背景、目的及意义；1.2 项目目标与主要内容，交代三门专业课、校选课“AI 工具实战应用”的贯穿作用和 15 个专题的范围。</w:t>
+      </w:r>
+    </w:p>
+    <w:p>
+      <w:pPr>
+        <w:pStyle w:val="Heading2"/>
+      </w:pPr>
+      <w:r>
+        <w:rPr>
+          <w:rFonts w:ascii="宋体" w:hAnsi="宋体" w:eastAsia="宋体"/>
+          <w:lang w:val="zh-CN" w:eastAsia="zh-CN"/>
+        </w:rPr>
+        <w:t xml:space="preserve">2 项目主体</w:t>
+      </w:r>
+    </w:p>
+    <w:p>
+      <w:r>
+        <w:rPr>
+          <w:rFonts w:ascii="宋体" w:hAnsi="宋体" w:eastAsia="宋体"/>
+          <w:lang w:val="zh-CN" w:eastAsia="zh-CN"/>
+        </w:rPr>
+        <w:t xml:space="preserve">2.1 项目前期筹备：依据教学大纲、教材和实训材料确认专题，说明工具、资料来源、制作规格和三人并行分工。</w:t>
+      </w:r>
+    </w:p>
+    <w:p>
+      <w:r>
+        <w:rPr>
+          <w:rFonts w:ascii="宋体" w:hAnsi="宋体" w:eastAsia="宋体"/>
+          <w:lang w:val="zh-CN" w:eastAsia="zh-CN"/>
+        </w:rPr>
+        <w:t xml:space="preserve">2.2 资源设计与制作：说明课程映射/案例任务卡、连环画脚本与成品、视频镜头脚本与成片、互动任务及教师答案的设计制作。</w:t>
+      </w:r>
+    </w:p>
+    <w:p>
+      <w:r>
+        <w:rPr>
+          <w:rFonts w:ascii="宋体" w:hAnsi="宋体" w:eastAsia="宋体"/>
+          <w:lang w:val="zh-CN" w:eastAsia="zh-CN"/>
+        </w:rPr>
+        <w:t xml:space="preserve">2.3 资源校对与完善：记录专业内容核验、教师确认、组内互审、版权与隐私检查、同学试做、问题整改和复测。</w:t>
+      </w:r>
+    </w:p>
+    <w:p>
+      <w:r>
+        <w:rPr>
+          <w:rFonts w:ascii="宋体" w:hAnsi="宋体" w:eastAsia="宋体"/>
+          <w:lang w:val="zh-CN" w:eastAsia="zh-CN"/>
+        </w:rPr>
+        <w:t xml:space="preserve">2.4 成果整理与展示：核对 15 篇连环画、15 支视频、15 组互动任务，说明归档目录、代表作演示、互动体验和展示反馈。</w:t>
+      </w:r>
+    </w:p>
+    <w:p>
+      <w:pPr>
+        <w:pStyle w:val="Heading2"/>
+      </w:pPr>
+      <w:r>
+        <w:rPr>
+          <w:rFonts w:ascii="宋体" w:hAnsi="宋体" w:eastAsia="宋体"/>
+          <w:lang w:val="zh-CN" w:eastAsia="zh-CN"/>
+        </w:rPr>
+        <w:t xml:space="preserve">3 项目实施过程中遇到的问题及解决方案</w:t>
+      </w:r>
+    </w:p>
+    <w:p>
+      <w:r>
+        <w:rPr>
+          <w:rFonts w:ascii="宋体" w:hAnsi="宋体" w:eastAsia="宋体"/>
+          <w:lang w:val="zh-CN" w:eastAsia="zh-CN"/>
+        </w:rPr>
+        <w:t xml:space="preserve">选取真实发生的问题，按现象/证据、原因、处理方法和复核结果说明；不得编造试用效果或未实际发生的困难。</w:t>
+      </w:r>
+    </w:p>
+    <w:p>
+      <w:pPr>
+        <w:pStyle w:val="Heading2"/>
+      </w:pPr>
+      <w:r>
+        <w:rPr>
+          <w:rFonts w:ascii="宋体" w:hAnsi="宋体" w:eastAsia="宋体"/>
+          <w:lang w:val="zh-CN" w:eastAsia="zh-CN"/>
+        </w:rPr>
+        <w:t xml:space="preserve">参考文献与附录</w:t>
+      </w:r>
+    </w:p>
+    <w:p>
+      <w:r>
+        <w:rPr>
+          <w:rFonts w:ascii="宋体" w:hAnsi="宋体" w:eastAsia="宋体"/>
+          <w:lang w:val="zh-CN" w:eastAsia="zh-CN"/>
+        </w:rPr>
+        <w:t xml:space="preserve">参考文献列出实际使用且可核验的教材、讲义和资料；附录建议收录 15 个专题总目录、代表性任务卡/漫画分镜/视频镜头脚本/互动任务及答案、AI 使用与专业校对记录、试做和修订记录，以及三名成员的分工贡献与个人心得。</w:t>
+      </w:r>
+    </w:p>
+    <w:p>
+      <w:r>
+        <w:rPr>
+          <w:rFonts w:ascii="宋体" w:hAnsi="宋体" w:eastAsia="宋体"/>
+          <w:lang w:val="zh-CN" w:eastAsia="zh-CN"/>
+        </w:rPr>
+        <w:t xml:space="preserve">如本届学院模板另有摘要、结论或规定章节顺序，以学院模板和指导教师要求为准；以上提纲用于借鉴往届报告的结构逻辑，不是照抄范例主题或文字。</w:t>
       </w:r>
     </w:p>
     <w:sectPr>

</xml_diff>